<commit_message>
Publish canonical UADC runtime and conversion test environments
</commit_message>
<xml_diff>
--- a/Specifications/UADC_Syntax_Binding_Program_Specification.docx
+++ b/Specifications/UADC_Syntax_Binding_Program_Specification.docx
@@ -32,14 +32,7 @@
     </w:p>
     <w:p>
       <w:r>
-        <w:rPr>
-          <w:b/>
-          <w:bCs/>
-        </w:rPr>
-        <w:t>Date</w:t>
-      </w:r>
-      <w:r>
-        <w:t>: 2026-08-16</w:t>
+        <w:t>Date: 2026-09-15</w:t>
       </w:r>
     </w:p>
     <w:p>
@@ -19013,6 +19006,775 @@
         <w:t>diagrams/04_data_structure_construction.mmd</w:t>
       </w:r>
     </w:p>
+    <w:p>
+      <w:r>
+        <w:br w:type="page"/>
+      </w:r>
+    </w:p>
+    <w:p>
+      <w:pPr>
+        <w:pStyle w:val="10"/>
+      </w:pPr>
+      <w:r>
+        <w:t>Specification Accepted on 2026/9/15</w:t>
+      </w:r>
+    </w:p>
+    <w:p>
+      <w:r>
+        <w:t>This section defines the current specification and takes precedence over earlier candidate descriptions and descriptions specific to the former 17-column format elsewhere in this document. It distinguishes design decisions, implemented behavior, and the validated scope. Arelle conformance does not constitute acceptance of complete accounting-information preservation or import into an actual application.</w:t>
+      </w:r>
+    </w:p>
+    <w:tbl>
+      <w:tblPr>
+        <w:tblStyle w:val="af7"/>
+        <w:tblW w:type="auto" w:w="0"/>
+        <w:tblLayout w:type="fixed"/>
+        <w:tblLook w:firstColumn="1" w:firstRow="1" w:lastColumn="0" w:lastRow="0" w:noHBand="0" w:noVBand="1" w:val="04A0"/>
+      </w:tblPr>
+      <w:tblGrid>
+        <w:gridCol w:w="4873"/>
+        <w:gridCol w:w="4873"/>
+      </w:tblGrid>
+      <w:tr>
+        <w:trPr>
+          <w:tblHeader w:val="true"/>
+        </w:trPr>
+        <w:tc>
+          <w:tcPr>
+            <w:tcW w:type="dxa" w:w="1512"/>
+            <w:vAlign w:val="center"/>
+            <w:tcMar>
+              <w:top w:w="70" w:type="dxa"/>
+              <w:start w:w="90" w:type="dxa"/>
+              <w:bottom w:w="70" w:type="dxa"/>
+              <w:end w:w="90" w:type="dxa"/>
+            </w:tcMar>
+            <w:shd w:fill="1F4E78"/>
+          </w:tcPr>
+          <w:p>
+            <w:pPr>
+              <w:spacing w:before="20" w:after="20" w:line="252" w:lineRule="auto"/>
+            </w:pPr>
+            <w:r>
+              <w:rPr>
+                <w:rFonts w:ascii="Yu Gothic" w:hAnsi="Yu Gothic"/>
+                <w:b/>
+                <w:color w:val="FFFFFF"/>
+                <w:sz w:val="17"/>
+              </w:rPr>
+              <w:t>Category</w:t>
+            </w:r>
+          </w:p>
+        </w:tc>
+        <w:tc>
+          <w:tcPr>
+            <w:tcW w:type="dxa" w:w="8136"/>
+            <w:vAlign w:val="center"/>
+            <w:tcMar>
+              <w:top w:w="70" w:type="dxa"/>
+              <w:start w:w="90" w:type="dxa"/>
+              <w:bottom w:w="70" w:type="dxa"/>
+              <w:end w:w="90" w:type="dxa"/>
+            </w:tcMar>
+            <w:shd w:fill="1F4E78"/>
+          </w:tcPr>
+          <w:p>
+            <w:pPr>
+              <w:spacing w:before="20" w:after="20" w:line="252" w:lineRule="auto"/>
+            </w:pPr>
+            <w:r>
+              <w:rPr>
+                <w:rFonts w:ascii="Yu Gothic" w:hAnsi="Yu Gothic"/>
+                <w:b/>
+                <w:color w:val="FFFFFF"/>
+                <w:sz w:val="17"/>
+              </w:rPr>
+              <w:t>Current Status</w:t>
+            </w:r>
+          </w:p>
+        </w:tc>
+      </w:tr>
+      <w:tr>
+        <w:tc>
+          <w:tcPr>
+            <w:tcW w:type="dxa" w:w="1512"/>
+            <w:vAlign w:val="center"/>
+            <w:tcMar>
+              <w:top w:w="70" w:type="dxa"/>
+              <w:start w:w="90" w:type="dxa"/>
+              <w:bottom w:w="70" w:type="dxa"/>
+              <w:end w:w="90" w:type="dxa"/>
+            </w:tcMar>
+          </w:tcPr>
+          <w:p>
+            <w:pPr>
+              <w:spacing w:before="20" w:after="20" w:line="252" w:lineRule="auto"/>
+            </w:pPr>
+            <w:r>
+              <w:rPr>
+                <w:rFonts w:ascii="Yu Gothic" w:hAnsi="Yu Gothic"/>
+                <w:color w:val="000000"/>
+                <w:sz w:val="17"/>
+              </w:rPr>
+              <w:t>Design Decision</w:t>
+            </w:r>
+          </w:p>
+        </w:tc>
+        <w:tc>
+          <w:tcPr>
+            <w:tcW w:type="dxa" w:w="8136"/>
+            <w:vAlign w:val="center"/>
+            <w:tcMar>
+              <w:top w:w="70" w:type="dxa"/>
+              <w:start w:w="90" w:type="dxa"/>
+              <w:bottom w:w="70" w:type="dxa"/>
+              <w:end w:w="90" w:type="dxa"/>
+            </w:tcMar>
+          </w:tcPr>
+          <w:p>
+            <w:pPr>
+              <w:spacing w:before="20" w:after="20" w:line="252" w:lineRule="auto"/>
+            </w:pPr>
+            <w:r>
+              <w:rPr>
+                <w:rFonts w:ascii="Yu Gothic" w:hAnsi="Yu Gothic"/>
+                <w:color w:val="000000"/>
+                <w:sz w:val="17"/>
+              </w:rPr>
+              <w:t>The canonical PCA/EPSON Binding uses 16 columns in a fixed order. The former 17-column form is accepted as compatibility input. Semantic identity is the selector-qualified semantic_path; selectors are removed for HMD resolution. The Binding does not contain an id column.</w:t>
+            </w:r>
+          </w:p>
+        </w:tc>
+      </w:tr>
+      <w:tr>
+        <w:tc>
+          <w:tcPr>
+            <w:tcW w:type="dxa" w:w="1512"/>
+            <w:vAlign w:val="center"/>
+            <w:tcMar>
+              <w:top w:w="70" w:type="dxa"/>
+              <w:start w:w="90" w:type="dxa"/>
+              <w:bottom w:w="70" w:type="dxa"/>
+              <w:end w:w="90" w:type="dxa"/>
+            </w:tcMar>
+            <w:shd w:fill="EAF2F8"/>
+          </w:tcPr>
+          <w:p>
+            <w:pPr>
+              <w:spacing w:before="20" w:after="20" w:line="252" w:lineRule="auto"/>
+            </w:pPr>
+            <w:r>
+              <w:rPr>
+                <w:rFonts w:ascii="Yu Gothic" w:hAnsi="Yu Gothic"/>
+                <w:color w:val="000000"/>
+                <w:sz w:val="17"/>
+              </w:rPr>
+              <w:t>Implemented</w:t>
+            </w:r>
+          </w:p>
+        </w:tc>
+        <w:tc>
+          <w:tcPr>
+            <w:tcW w:type="dxa" w:w="8136"/>
+            <w:vAlign w:val="center"/>
+            <w:tcMar>
+              <w:top w:w="70" w:type="dxa"/>
+              <w:start w:w="90" w:type="dxa"/>
+              <w:bottom w:w="70" w:type="dxa"/>
+              <w:end w:w="90" w:type="dxa"/>
+            </w:tcMar>
+            <w:shd w:fill="EAF2F8"/>
+          </w:tcPr>
+          <w:p>
+            <w:pPr>
+              <w:spacing w:before="20" w:after="20" w:line="252" w:lineRule="auto"/>
+            </w:pPr>
+            <w:r>
+              <w:rPr>
+                <w:rFonts w:ascii="Yu Gothic" w:hAnsi="Yu Gothic"/>
+                <w:color w:val="000000"/>
+                <w:sz w:val="17"/>
+              </w:rPr>
+              <w:t>tools/uadc/flat_csv.py reads the 16-column CANONICAL_FIELDS and the 17-column LEGACY_17_FIELDS, validates the HMD semantic_path and sequence, definition tables, grouping, and tax and account mappings, and performs bidirectional conversion.</w:t>
+            </w:r>
+          </w:p>
+        </w:tc>
+      </w:tr>
+      <w:tr>
+        <w:tc>
+          <w:tcPr>
+            <w:tcW w:type="dxa" w:w="1512"/>
+            <w:vAlign w:val="center"/>
+            <w:tcMar>
+              <w:top w:w="70" w:type="dxa"/>
+              <w:start w:w="90" w:type="dxa"/>
+              <w:bottom w:w="70" w:type="dxa"/>
+              <w:end w:w="90" w:type="dxa"/>
+            </w:tcMar>
+          </w:tcPr>
+          <w:p>
+            <w:pPr>
+              <w:spacing w:before="20" w:after="20" w:line="252" w:lineRule="auto"/>
+            </w:pPr>
+            <w:r>
+              <w:rPr>
+                <w:rFonts w:ascii="Yu Gothic" w:hAnsi="Yu Gothic"/>
+                <w:color w:val="000000"/>
+                <w:sz w:val="17"/>
+              </w:rPr>
+              <w:t>Validated</w:t>
+            </w:r>
+          </w:p>
+        </w:tc>
+        <w:tc>
+          <w:tcPr>
+            <w:tcW w:type="dxa" w:w="8136"/>
+            <w:vAlign w:val="center"/>
+            <w:tcMar>
+              <w:top w:w="70" w:type="dxa"/>
+              <w:start w:w="90" w:type="dxa"/>
+              <w:bottom w:w="70" w:type="dxa"/>
+              <w:end w:w="90" w:type="dxa"/>
+            </w:tcMar>
+          </w:tcPr>
+          <w:p>
+            <w:pPr>
+              <w:spacing w:before="20" w:after="20" w:line="252" w:lineRule="auto"/>
+            </w:pPr>
+            <w:r>
+              <w:rPr>
+                <w:rFonts w:ascii="Yu Gothic" w:hAnsi="Yu Gothic"/>
+                <w:color w:val="000000"/>
+                <w:sz w:val="17"/>
+              </w:rPr>
+              <w:t>The accepted formal PCA and EPSON xBRL-CSV instances contain 130,807 and 134,281 facts, respectively, and pass Arelle 2.37.77 validation with 0 errors and 0 warnings. Each AE and BT Tuple/OIM entry point also passes with 0 errors and 0 warnings.</w:t>
+            </w:r>
+          </w:p>
+        </w:tc>
+      </w:tr>
+      <w:tr>
+        <w:tc>
+          <w:tcPr>
+            <w:tcW w:type="dxa" w:w="1512"/>
+            <w:vAlign w:val="center"/>
+            <w:tcMar>
+              <w:top w:w="70" w:type="dxa"/>
+              <w:start w:w="90" w:type="dxa"/>
+              <w:bottom w:w="70" w:type="dxa"/>
+              <w:end w:w="90" w:type="dxa"/>
+            </w:tcMar>
+            <w:shd w:fill="EAF2F8"/>
+          </w:tcPr>
+          <w:p>
+            <w:pPr>
+              <w:spacing w:before="20" w:after="20" w:line="252" w:lineRule="auto"/>
+            </w:pPr>
+            <w:r>
+              <w:rPr>
+                <w:rFonts w:ascii="Yu Gothic" w:hAnsi="Yu Gothic"/>
+                <w:color w:val="000000"/>
+                <w:sz w:val="17"/>
+              </w:rPr>
+              <w:t>Unresolved</w:t>
+            </w:r>
+          </w:p>
+        </w:tc>
+        <w:tc>
+          <w:tcPr>
+            <w:tcW w:type="dxa" w:w="8136"/>
+            <w:vAlign w:val="center"/>
+            <w:tcMar>
+              <w:top w:w="70" w:type="dxa"/>
+              <w:start w:w="90" w:type="dxa"/>
+              <w:bottom w:w="70" w:type="dxa"/>
+              <w:end w:w="90" w:type="dxa"/>
+            </w:tcMar>
+            <w:shd w:fill="EAF2F8"/>
+          </w:tcPr>
+          <w:p>
+            <w:pPr>
+              <w:spacing w:before="20" w:after="20" w:line="252" w:lineRule="auto"/>
+            </w:pPr>
+            <w:r>
+              <w:rPr>
+                <w:rFonts w:ascii="Yu Gothic" w:hAnsi="Yu Gothic"/>
+                <w:color w:val="000000"/>
+                <w:sz w:val="17"/>
+              </w:rPr>
+              <w:t>The following remain unresolved: tax-amount facts are not preserved for explicitly stated EPSON tax amounts totaling JPY 141,601,937 across 3,490 detail lines; EPSON-to-PCA conversion reports TAX_POLICY_AMBIGUOUS; and EPSON account registration and import into the actual application have not been verified.</w:t>
+            </w:r>
+          </w:p>
+        </w:tc>
+      </w:tr>
+    </w:tbl>
+    <w:p/>
+    <w:p>
+      <w:pPr>
+        <w:pStyle w:val="20"/>
+      </w:pPr>
+      <w:r>
+        <w:t>Identifiers in the Binding and Structured CSV</w:t>
+      </w:r>
+    </w:p>
+    <w:p>
+      <w:r>
+        <w:t>The 16-column Binding order is sequence, level, type, name, datatype, multiplicity, column, semantic_path, occurrence_mode, group_key, row_role, max_occurs, default_value, transformation, required, note. The former 17-column form includes id after type and is normalized for compatibility when read. Do not restore id to newly created PCA/EPSON Bindings.</w:t>
+      </w:r>
+    </w:p>
+    <w:p>
+      <w:r>
+        <w:t>Removal of id from the Binding and the id column in Structured CSV are separate contracts. The Flat CSV runtime retains the following 11 Structured CSV columns: entry_key, source_row, occurrence, sequence, level, type, id, name, semantic_path, binding_path, value. An empty Structured CSV id does not, by itself, indicate a conversion defect. Do not populate it from HMD id, source_bsm_id, or identifier.</w:t>
+      </w:r>
+    </w:p>
+    <w:p>
+      <w:pPr>
+        <w:pStyle w:val="20"/>
+      </w:pPr>
+      <w:r>
+        <w:t>Taxonomy and Validation Entry Points</w:t>
+      </w:r>
+    </w:p>
+    <w:p>
+      <w:r>
+        <w:t>The project module namespace is https://www.xbrl.or.jp/taxonomy/xbrl-gl-next/{module} for the applicable module. Accounting Entries and Business Transactions are split DTSs generated from different root HMDs. The type, structure, and multiplicity differences in 14 shared declarations are accepted root-HMD-specific structural differences; exact equality between AE and BT is not required. Consumers select the corresponding AE or BT entry point and must neither overwrite same-named files nor combine both DTSs unconditionally. Integration into a single DTS is outside the accepted scope.</w:t>
+      </w:r>
+    </w:p>
+    <w:p>
+      <w:pPr>
+        <w:pStyle w:val="20"/>
+      </w:pPr>
+      <w:r>
+        <w:t>Structured CSV, Formal xBRL-CSV, and LedgerExplorer</w:t>
+      </w:r>
+    </w:p>
+    <w:tbl>
+      <w:tblPr>
+        <w:tblStyle w:val="af7"/>
+        <w:tblW w:type="auto" w:w="0"/>
+        <w:tblLayout w:type="fixed"/>
+        <w:tblLook w:firstColumn="1" w:firstRow="1" w:lastColumn="0" w:lastRow="0" w:noHBand="0" w:noVBand="1" w:val="04A0"/>
+      </w:tblPr>
+      <w:tblGrid>
+        <w:gridCol w:w="4873"/>
+        <w:gridCol w:w="4873"/>
+      </w:tblGrid>
+      <w:tr>
+        <w:trPr>
+          <w:tblHeader w:val="true"/>
+        </w:trPr>
+        <w:tc>
+          <w:tcPr>
+            <w:tcW w:type="dxa" w:w="2016"/>
+            <w:vAlign w:val="center"/>
+            <w:tcMar>
+              <w:top w:w="70" w:type="dxa"/>
+              <w:start w:w="90" w:type="dxa"/>
+              <w:bottom w:w="70" w:type="dxa"/>
+              <w:end w:w="90" w:type="dxa"/>
+            </w:tcMar>
+            <w:shd w:fill="1F4E78"/>
+          </w:tcPr>
+          <w:p>
+            <w:pPr>
+              <w:spacing w:before="20" w:after="20" w:line="252" w:lineRule="auto"/>
+            </w:pPr>
+            <w:r>
+              <w:rPr>
+                <w:rFonts w:ascii="Yu Gothic" w:hAnsi="Yu Gothic"/>
+                <w:b/>
+                <w:color w:val="FFFFFF"/>
+                <w:sz w:val="17"/>
+              </w:rPr>
+              <w:t>Artifact</w:t>
+            </w:r>
+          </w:p>
+        </w:tc>
+        <w:tc>
+          <w:tcPr>
+            <w:tcW w:type="dxa" w:w="7632"/>
+            <w:vAlign w:val="center"/>
+            <w:tcMar>
+              <w:top w:w="70" w:type="dxa"/>
+              <w:start w:w="90" w:type="dxa"/>
+              <w:bottom w:w="70" w:type="dxa"/>
+              <w:end w:w="90" w:type="dxa"/>
+            </w:tcMar>
+            <w:shd w:fill="1F4E78"/>
+          </w:tcPr>
+          <w:p>
+            <w:pPr>
+              <w:spacing w:before="20" w:after="20" w:line="252" w:lineRule="auto"/>
+            </w:pPr>
+            <w:r>
+              <w:rPr>
+                <w:rFonts w:ascii="Yu Gothic" w:hAnsi="Yu Gothic"/>
+                <w:b/>
+                <w:color w:val="FFFFFF"/>
+                <w:sz w:val="17"/>
+              </w:rPr>
+              <w:t>Role and Acceptance Boundary</w:t>
+            </w:r>
+          </w:p>
+        </w:tc>
+      </w:tr>
+      <w:tr>
+        <w:tc>
+          <w:tcPr>
+            <w:tcW w:type="dxa" w:w="2016"/>
+            <w:vAlign w:val="center"/>
+            <w:tcMar>
+              <w:top w:w="70" w:type="dxa"/>
+              <w:start w:w="90" w:type="dxa"/>
+              <w:bottom w:w="70" w:type="dxa"/>
+              <w:end w:w="90" w:type="dxa"/>
+            </w:tcMar>
+          </w:tcPr>
+          <w:p>
+            <w:pPr>
+              <w:spacing w:before="20" w:after="20" w:line="252" w:lineRule="auto"/>
+            </w:pPr>
+            <w:r>
+              <w:rPr>
+                <w:rFonts w:ascii="Yu Gothic" w:hAnsi="Yu Gothic"/>
+                <w:color w:val="000000"/>
+                <w:sz w:val="17"/>
+              </w:rPr>
+              <w:t>Structured CSV</w:t>
+            </w:r>
+          </w:p>
+        </w:tc>
+        <w:tc>
+          <w:tcPr>
+            <w:tcW w:type="dxa" w:w="7632"/>
+            <w:vAlign w:val="center"/>
+            <w:tcMar>
+              <w:top w:w="70" w:type="dxa"/>
+              <w:start w:w="90" w:type="dxa"/>
+              <w:bottom w:w="70" w:type="dxa"/>
+              <w:end w:w="90" w:type="dxa"/>
+            </w:tcMar>
+          </w:tcPr>
+          <w:p>
+            <w:pPr>
+              <w:spacing w:before="20" w:after="20" w:line="252" w:lineRule="auto"/>
+            </w:pPr>
+            <w:r>
+              <w:rPr>
+                <w:rFonts w:ascii="Yu Gothic" w:hAnsi="Yu Gothic"/>
+                <w:color w:val="000000"/>
+                <w:sz w:val="17"/>
+              </w:rPr>
+              <w:t>Long-form or hierarchical data for conversion and review, containing semantic_path and occurrence/dimension information. Do not submit this data itself to Arelle in place of formal xBRL-CSV metadata.</w:t>
+            </w:r>
+          </w:p>
+        </w:tc>
+      </w:tr>
+      <w:tr>
+        <w:tc>
+          <w:tcPr>
+            <w:tcW w:type="dxa" w:w="2016"/>
+            <w:vAlign w:val="center"/>
+            <w:tcMar>
+              <w:top w:w="70" w:type="dxa"/>
+              <w:start w:w="90" w:type="dxa"/>
+              <w:bottom w:w="70" w:type="dxa"/>
+              <w:end w:w="90" w:type="dxa"/>
+            </w:tcMar>
+            <w:shd w:fill="EAF2F8"/>
+          </w:tcPr>
+          <w:p>
+            <w:pPr>
+              <w:spacing w:before="20" w:after="20" w:line="252" w:lineRule="auto"/>
+            </w:pPr>
+            <w:r>
+              <w:rPr>
+                <w:rFonts w:ascii="Yu Gothic" w:hAnsi="Yu Gothic"/>
+                <w:color w:val="000000"/>
+                <w:sz w:val="17"/>
+              </w:rPr>
+              <w:t>Formal xBRL-CSV</w:t>
+            </w:r>
+          </w:p>
+        </w:tc>
+        <w:tc>
+          <w:tcPr>
+            <w:tcW w:type="dxa" w:w="7632"/>
+            <w:vAlign w:val="center"/>
+            <w:tcMar>
+              <w:top w:w="70" w:type="dxa"/>
+              <w:start w:w="90" w:type="dxa"/>
+              <w:bottom w:w="70" w:type="dxa"/>
+              <w:end w:w="90" w:type="dxa"/>
+            </w:tcMar>
+            <w:shd w:fill="EAF2F8"/>
+          </w:tcPr>
+          <w:p>
+            <w:pPr>
+              <w:spacing w:before="20" w:after="20" w:line="252" w:lineRule="auto"/>
+            </w:pPr>
+            <w:r>
+              <w:rPr>
+                <w:rFonts w:ascii="Yu Gothic" w:hAnsi="Yu Gothic"/>
+                <w:color w:val="000000"/>
+                <w:sz w:val="17"/>
+              </w:rPr>
+              <w:t>Use the JSON metadata as the entry point and validate the referenced CSV together with the DTS identified by documentInfo.taxonomy. Use Arelle to determine conformance of QNames, concepts, datatypes, entities, periods, units, and dimensions.</w:t>
+            </w:r>
+          </w:p>
+        </w:tc>
+      </w:tr>
+      <w:tr>
+        <w:tc>
+          <w:tcPr>
+            <w:tcW w:type="dxa" w:w="2016"/>
+            <w:vAlign w:val="center"/>
+            <w:tcMar>
+              <w:top w:w="70" w:type="dxa"/>
+              <w:start w:w="90" w:type="dxa"/>
+              <w:bottom w:w="70" w:type="dxa"/>
+              <w:end w:w="90" w:type="dxa"/>
+            </w:tcMar>
+          </w:tcPr>
+          <w:p>
+            <w:pPr>
+              <w:spacing w:before="20" w:after="20" w:line="252" w:lineRule="auto"/>
+            </w:pPr>
+            <w:r>
+              <w:rPr>
+                <w:rFonts w:ascii="Yu Gothic" w:hAnsi="Yu Gothic"/>
+                <w:color w:val="000000"/>
+                <w:sz w:val="17"/>
+              </w:rPr>
+              <w:t>LedgerExplorer</w:t>
+            </w:r>
+          </w:p>
+        </w:tc>
+        <w:tc>
+          <w:tcPr>
+            <w:tcW w:type="dxa" w:w="7632"/>
+            <w:vAlign w:val="center"/>
+            <w:tcMar>
+              <w:top w:w="70" w:type="dxa"/>
+              <w:start w:w="90" w:type="dxa"/>
+              <w:bottom w:w="70" w:type="dxa"/>
+              <w:end w:w="90" w:type="dxa"/>
+            </w:tcMar>
+          </w:tcPr>
+          <w:p>
+            <w:pPr>
+              <w:spacing w:before="20" w:after="20" w:line="252" w:lineRule="auto"/>
+            </w:pPr>
+            <w:r>
+              <w:rPr>
+                <w:rFonts w:ascii="Yu Gothic" w:hAnsi="Yu Gothic"/>
+                <w:color w:val="000000"/>
+                <w:sz w:val="17"/>
+              </w:rPr>
+              <w:t>A separate consumer that uses the corresponding Cn Structured Tidy input contract. Accepted Phase 1 screen evidence exists, but it does not automatically establish acceptance of an actual connection to the latest PCA/EPSON versions or verification of all screens.</w:t>
+            </w:r>
+          </w:p>
+        </w:tc>
+      </w:tr>
+    </w:tbl>
+    <w:p/>
+    <w:p>
+      <w:pPr>
+        <w:pStyle w:val="20"/>
+      </w:pPr>
+      <w:r>
+        <w:t>Current Responsibilities of Syntax Binding</w:t>
+      </w:r>
+    </w:p>
+    <w:p>
+      <w:r>
+        <w:t>Syntax Binding defines syntax_path, selectors, fixed values, transformations, and output order for XML, JSON, and other syntaxes, and binds them to HMD semantic_path values. For formal xBRL-CSV, the JSON metadata is the entry point; do not submit the CSV alone or long-form Structured CSV alone to Arelle.</w:t>
+      </w:r>
+    </w:p>
+    <w:p>
+      <w:pPr>
+        <w:pStyle w:val="20"/>
+      </w:pPr>
+      <w:r>
+        <w:t>Revision History</w:t>
+      </w:r>
+    </w:p>
+    <w:tbl>
+      <w:tblPr>
+        <w:tblStyle w:val="af7"/>
+        <w:tblW w:type="auto" w:w="0"/>
+        <w:tblLayout w:type="fixed"/>
+        <w:tblLook w:firstColumn="1" w:firstRow="1" w:lastColumn="0" w:lastRow="0" w:noHBand="0" w:noVBand="1" w:val="04A0"/>
+      </w:tblPr>
+      <w:tblGrid>
+        <w:gridCol w:w="3249"/>
+        <w:gridCol w:w="3249"/>
+        <w:gridCol w:w="3249"/>
+      </w:tblGrid>
+      <w:tr>
+        <w:trPr>
+          <w:tblHeader w:val="true"/>
+        </w:trPr>
+        <w:tc>
+          <w:tcPr>
+            <w:tcW w:type="dxa" w:w="1440"/>
+            <w:vAlign w:val="center"/>
+            <w:tcMar>
+              <w:top w:w="70" w:type="dxa"/>
+              <w:start w:w="90" w:type="dxa"/>
+              <w:bottom w:w="70" w:type="dxa"/>
+              <w:end w:w="90" w:type="dxa"/>
+            </w:tcMar>
+            <w:shd w:fill="1F4E78"/>
+          </w:tcPr>
+          <w:p>
+            <w:pPr>
+              <w:spacing w:before="20" w:after="20" w:line="252" w:lineRule="auto"/>
+            </w:pPr>
+            <w:r>
+              <w:rPr>
+                <w:rFonts w:ascii="Yu Gothic" w:hAnsi="Yu Gothic"/>
+                <w:b/>
+                <w:color w:val="FFFFFF"/>
+                <w:sz w:val="17"/>
+              </w:rPr>
+              <w:t>Revision Date</w:t>
+            </w:r>
+          </w:p>
+        </w:tc>
+        <w:tc>
+          <w:tcPr>
+            <w:tcW w:type="dxa" w:w="5760"/>
+            <w:vAlign w:val="center"/>
+            <w:tcMar>
+              <w:top w:w="70" w:type="dxa"/>
+              <w:start w:w="90" w:type="dxa"/>
+              <w:bottom w:w="70" w:type="dxa"/>
+              <w:end w:w="90" w:type="dxa"/>
+            </w:tcMar>
+            <w:shd w:fill="1F4E78"/>
+          </w:tcPr>
+          <w:p>
+            <w:pPr>
+              <w:spacing w:before="20" w:after="20" w:line="252" w:lineRule="auto"/>
+            </w:pPr>
+            <w:r>
+              <w:rPr>
+                <w:rFonts w:ascii="Yu Gothic" w:hAnsi="Yu Gothic"/>
+                <w:b/>
+                <w:color w:val="FFFFFF"/>
+                <w:sz w:val="17"/>
+              </w:rPr>
+              <w:t>Description</w:t>
+            </w:r>
+          </w:p>
+        </w:tc>
+        <w:tc>
+          <w:tcPr>
+            <w:tcW w:type="dxa" w:w="2448"/>
+            <w:vAlign w:val="center"/>
+            <w:tcMar>
+              <w:top w:w="70" w:type="dxa"/>
+              <w:start w:w="90" w:type="dxa"/>
+              <w:bottom w:w="70" w:type="dxa"/>
+              <w:end w:w="90" w:type="dxa"/>
+            </w:tcMar>
+            <w:shd w:fill="1F4E78"/>
+          </w:tcPr>
+          <w:p>
+            <w:pPr>
+              <w:spacing w:before="20" w:after="20" w:line="252" w:lineRule="auto"/>
+            </w:pPr>
+            <w:r>
+              <w:rPr>
+                <w:rFonts w:ascii="Yu Gothic" w:hAnsi="Yu Gothic"/>
+                <w:b/>
+                <w:color w:val="FFFFFF"/>
+                <w:sz w:val="17"/>
+              </w:rPr>
+              <w:t>Source</w:t>
+            </w:r>
+          </w:p>
+        </w:tc>
+      </w:tr>
+      <w:tr>
+        <w:tc>
+          <w:tcPr>
+            <w:tcW w:type="dxa" w:w="1440"/>
+            <w:vAlign w:val="center"/>
+            <w:tcMar>
+              <w:top w:w="70" w:type="dxa"/>
+              <w:start w:w="90" w:type="dxa"/>
+              <w:bottom w:w="70" w:type="dxa"/>
+              <w:end w:w="90" w:type="dxa"/>
+            </w:tcMar>
+          </w:tcPr>
+          <w:p>
+            <w:pPr>
+              <w:spacing w:before="20" w:after="20" w:line="252" w:lineRule="auto"/>
+            </w:pPr>
+            <w:r>
+              <w:rPr>
+                <w:rFonts w:ascii="Yu Gothic" w:hAnsi="Yu Gothic"/>
+                <w:color w:val="000000"/>
+                <w:sz w:val="17"/>
+              </w:rPr>
+              <w:t>2026-09-15</w:t>
+            </w:r>
+          </w:p>
+        </w:tc>
+        <w:tc>
+          <w:tcPr>
+            <w:tcW w:type="dxa" w:w="5760"/>
+            <w:vAlign w:val="center"/>
+            <w:tcMar>
+              <w:top w:w="70" w:type="dxa"/>
+              <w:start w:w="90" w:type="dxa"/>
+              <w:bottom w:w="70" w:type="dxa"/>
+              <w:end w:w="90" w:type="dxa"/>
+            </w:tcMar>
+          </w:tcPr>
+          <w:p>
+            <w:pPr>
+              <w:spacing w:before="20" w:after="20" w:line="252" w:lineRule="auto"/>
+            </w:pPr>
+            <w:r>
+              <w:rPr>
+                <w:rFonts w:ascii="Yu Gothic" w:hAnsi="Yu Gothic"/>
+                <w:color w:val="000000"/>
+                <w:sz w:val="17"/>
+              </w:rPr>
+              <w:t>Aligned with the canonical 16-column Binding, definition tables, tax processing, compound journal entries, formal xBRL-CSV, the stable namespace, the AE/BT split, and known issues.</w:t>
+            </w:r>
+          </w:p>
+        </w:tc>
+        <w:tc>
+          <w:tcPr>
+            <w:tcW w:type="dxa" w:w="2448"/>
+            <w:vAlign w:val="center"/>
+            <w:tcMar>
+              <w:top w:w="70" w:type="dxa"/>
+              <w:start w:w="90" w:type="dxa"/>
+              <w:bottom w:w="70" w:type="dxa"/>
+              <w:end w:w="90" w:type="dxa"/>
+            </w:tcMar>
+          </w:tcPr>
+          <w:p>
+            <w:pPr>
+              <w:spacing w:before="20" w:after="20" w:line="252" w:lineRule="auto"/>
+            </w:pPr>
+            <w:r>
+              <w:rPr>
+                <w:rFonts w:ascii="Yu Gothic" w:hAnsi="Yu Gothic"/>
+                <w:color w:val="000000"/>
+                <w:sz w:val="17"/>
+              </w:rPr>
+              <w:t>Canonical WORK predecessor SHA-256 294A5D3B7B079278285C807FB0C22F8F687874A8AA2D4F17B7B266BAE1FCB1D1</w:t>
+            </w:r>
+          </w:p>
+        </w:tc>
+      </w:tr>
+    </w:tbl>
+    <w:p/>
     <w:sectPr>
       <w:headerReference w:type="even" r:id="rId14"/>
       <w:headerReference w:type="default" r:id="rId15"/>
@@ -19180,7 +19942,7 @@
       <w:pStyle w:val="af3"/>
     </w:pPr>
     <w:r>
-      <w:t>XBRL GL Next Taxonomy Framework  — Part 1: General rules</w:t>
+      <w:t>UADC Program Specification  — Syntax Binding</w:t>
     </w:r>
   </w:p>
 </w:hdr>

</xml_diff>